<commit_message>
fix: TEBS datasheet - SARN placeholder + correct leading zeros
- Added {{BRAKE_SARN}} placeholder to tebs-template.docx (was hardcoded)
- Fixed SARN numbers with leading zeros:
  3-axle: 035391 CS, 4-axle: 033261 CS, 5-axle: 047495 CS, 6-axle: 047497 CS
- Front/rear axle counts (section 2) already populated via template
- ECU mount direction already hardcoded as Forward facing in template

Co-Authored-By: Claude Sonnet 4.6 <noreply@anthropic.com>
</commit_message>
<xml_diff>
--- a/public/tebs-template.docx
+++ b/public/tebs-template.docx
@@ -50,34 +50,7 @@
           <w:sz w:val="24"/>
           <w:szCs w:val="96"/>
         </w:rPr>
-        <w:t>3</w:t>
-      </w:r>
-      <w:r>
-        <w:rPr>
-          <w:rFonts w:cs="Broadway"/>
-          <w:bCs/>
-          <w:sz w:val="24"/>
-          <w:szCs w:val="96"/>
-        </w:rPr>
-        <w:t>539</w:t>
-      </w:r>
-      <w:r>
-        <w:rPr>
-          <w:rFonts w:cs="Broadway"/>
-          <w:bCs/>
-          <w:sz w:val="24"/>
-          <w:szCs w:val="96"/>
-        </w:rPr>
-        <w:t xml:space="preserve">1 </w:t>
-      </w:r>
-      <w:r>
-        <w:rPr>
-          <w:rFonts w:cs="Broadway"/>
-          <w:bCs/>
-          <w:sz w:val="24"/>
-          <w:szCs w:val="96"/>
-        </w:rPr>
-        <w:t>CS</w:t>
+        <w:t>{{BRAKE_SARN}}</w:t>
       </w:r>
     </w:p>
     <w:p>

</xml_diff>

<commit_message>
Fix TEBS template line 8: replace hardcoded text with {{FEATURES}} placeholder
Collapsed 4 hardcoded XML runs ('Front pressure sensor', ', Lift Up Axle (GIO2)',
', Hardox body', ', ') into a single {{FEATURES}} placeholder run so tebs.ts
can dynamically populate it.

Co-Authored-By: Claude Sonnet 4.6 <noreply@anthropic.com>
</commit_message>
<xml_diff>
--- a/public/tebs-template.docx
+++ b/public/tebs-template.docx
@@ -6748,37 +6748,7 @@
           <w:sz w:val="24"/>
           <w:szCs w:val="96"/>
         </w:rPr>
-        <w:t>Front pressure sensor</w:t>
-      </w:r>
-      <w:r>
-        <w:rPr>
-          <w:rFonts w:cs="Broadway"/>
-          <w:b/>
-          <w:bCs/>
-          <w:sz w:val="24"/>
-          <w:szCs w:val="96"/>
-        </w:rPr>
-        <w:t>, Lift Up Axle (GIO2)</w:t>
-      </w:r>
-      <w:r>
-        <w:rPr>
-          <w:rFonts w:cs="Broadway"/>
-          <w:b/>
-          <w:bCs/>
-          <w:sz w:val="24"/>
-          <w:szCs w:val="96"/>
-        </w:rPr>
-        <w:t>, Hardox body</w:t>
-      </w:r>
-      <w:r>
-        <w:rPr>
-          <w:rFonts w:cs="Broadway"/>
-          <w:b/>
-          <w:bCs/>
-          <w:sz w:val="24"/>
-          <w:szCs w:val="96"/>
-        </w:rPr>
-        <w:t xml:space="preserve">, </w:t>
+        <w:t>{{FEATURES}}</w:t>
       </w:r>
     </w:p>
     <w:p>

</xml_diff>